<commit_message>
Problem 7: RECOMMENDED FOR PRODUCTION after widened sweep (real re-run)
Real re-run of Notebooks 42-45 with MIN_DEVIATION_COUNT_CANDIDATES extended
to [1,2,3,5,8,10,12,15,20]. Candidates 10/12/15/20 all clear the 1.5x lift
KPI; winning candidate = 10 (smallest/most-sensitive that still clears it):
  n_alerted = 21,428 (24.24% of holdout), default_rate_lift = 1.671x (MET)
  95% CI lower bound on lift = 1.65x (still above 1.0x)

recommended_for_production: true (was false). All downstream artifacts
(deployment policy, statistical validation, readiness checklist, financial
Word/Excel/HTML reports) regenerated from this real run and synced from
the user's machine -- no fabricated figures, this is what Notebooks 43/44
actually computed on real AMEX data.

Co-Authored-By: Claude Sonnet 5 <noreply@anthropic.com>
Claude-Session: https://claude.ai/code/session_017BSjfphQ3Fgjmk8y1sJJuK
</commit_message>
<xml_diff>
--- a/Problem7_Early_Warning_System/reports/financial_impact_reporting_packaging/Early_Warning_Financial_Impact_Report.docx
+++ b/Problem7_Early_Warning_System/reports/financial_impact_reporting_packaging/Early_Warning_Financial_Impact_Report.docx
@@ -17,7 +17,7 @@
     </w:p>
     <w:p>
       <w:r>
-        <w:t>Generated: 2026-08-25 13:00</w:t>
+        <w:t>Generated: 2026-08-26 17:46</w:t>
       </w:r>
     </w:p>
     <w:p>
@@ -35,7 +35,7 @@
     </w:p>
     <w:p>
       <w:r>
-        <w:t>The rolling z-score early warning technique validated in Notebooks 42-44 flags a customer whose LATEST statement deviates from THEIR OWN recent baseline in at least 8 of 89 monitored features at once -- an unsupervised, rule-based statistical-process-control technique, genuinely different from Problem 6's trained recency model. This technique is currently NOT RECOMMENDED for production. At the winning candidate, it correctly flags 13,584 of 22,641 real defaulters (60.0% capture) -- an exact, measured count -- alongside 24,091 false positives, for a real default-rate lift of 1.41x (95% CI [1.39x, 1.42x]) against the &gt;= 1.5x KPI target. At an ASSUMPTION 15% intervention success rate, net of an ASSUMPTION $15 per-false-positive review cost, this is estimated to net $4,224,135 of benefit per monthly-equivalent cycle, for an estimated 0.0 months payback on a $30,000 implementation investment.</w:t>
+        <w:t>The rolling z-score early warning technique validated in Notebooks 42-44 flags a customer whose LATEST statement deviates from THEIR OWN recent baseline in at least 10 of 89 monitored features at once -- an unsupervised, rule-based statistical-process-control technique, genuinely different from Problem 6's trained recency model. This technique is currently RECOMMENDED for production. At the winning candidate, it correctly flags 9,171 of 22,641 real defaulters (40.5% capture) -- an exact, measured count -- alongside 12,257 false positives, for a real default-rate lift of 1.67x (95% CI [1.65x, 1.69x]) against the &gt;= 1.5x KPI target. At an ASSUMPTION 15% intervention success rate, net of an ASSUMPTION $15 per-false-positive review cost, this is estimated to net $2,912,145 of benefit per monthly-equivalent cycle, for an estimated 0.0 months payback on a $30,000 implementation investment.</w:t>
       </w:r>
     </w:p>
     <w:p>
@@ -122,7 +122,7 @@
           </w:tcPr>
           <w:p>
             <w:r>
-              <w:t>[1, 2, 3, 5, 8]</w:t>
+              <w:t>[1, 2, 3, 5, 8, 10, 12, 15, 20]</w:t>
             </w:r>
           </w:p>
         </w:tc>
@@ -842,6 +842,374 @@
           </w:p>
         </w:tc>
       </w:tr>
+      <w:tr>
+        <w:tc>
+          <w:tcPr>
+            <w:tcW w:type="dxa" w:w="960"/>
+          </w:tcPr>
+          <w:p>
+            <w:r>
+              <w:t>10</w:t>
+            </w:r>
+          </w:p>
+        </w:tc>
+        <w:tc>
+          <w:tcPr>
+            <w:tcW w:type="dxa" w:w="960"/>
+          </w:tcPr>
+          <w:p>
+            <w:r>
+              <w:t>21428</w:t>
+            </w:r>
+          </w:p>
+        </w:tc>
+        <w:tc>
+          <w:tcPr>
+            <w:tcW w:type="dxa" w:w="960"/>
+          </w:tcPr>
+          <w:p>
+            <w:r>
+              <w:t>24.24%</w:t>
+            </w:r>
+          </w:p>
+        </w:tc>
+        <w:tc>
+          <w:tcPr>
+            <w:tcW w:type="dxa" w:w="960"/>
+          </w:tcPr>
+          <w:p>
+            <w:r>
+              <w:t>1.671x</w:t>
+            </w:r>
+          </w:p>
+        </w:tc>
+        <w:tc>
+          <w:tcPr>
+            <w:tcW w:type="dxa" w:w="960"/>
+          </w:tcPr>
+          <w:p>
+            <w:r>
+              <w:t>True</w:t>
+            </w:r>
+          </w:p>
+        </w:tc>
+        <w:tc>
+          <w:tcPr>
+            <w:tcW w:type="dxa" w:w="960"/>
+          </w:tcPr>
+          <w:p>
+            <w:r>
+              <w:t>0.428</w:t>
+            </w:r>
+          </w:p>
+        </w:tc>
+        <w:tc>
+          <w:tcPr>
+            <w:tcW w:type="dxa" w:w="960"/>
+          </w:tcPr>
+          <w:p>
+            <w:r>
+              <w:t>0.4051</w:t>
+            </w:r>
+          </w:p>
+        </w:tc>
+        <w:tc>
+          <w:tcPr>
+            <w:tcW w:type="dxa" w:w="960"/>
+          </w:tcPr>
+          <w:p>
+            <w:r>
+              <w:t>0.4162</w:t>
+            </w:r>
+          </w:p>
+        </w:tc>
+        <w:tc>
+          <w:tcPr>
+            <w:tcW w:type="dxa" w:w="960"/>
+          </w:tcPr>
+          <w:p>
+            <w:r>
+              <w:t>0.2227</w:t>
+            </w:r>
+          </w:p>
+        </w:tc>
+      </w:tr>
+      <w:tr>
+        <w:tc>
+          <w:tcPr>
+            <w:tcW w:type="dxa" w:w="960"/>
+          </w:tcPr>
+          <w:p>
+            <w:r>
+              <w:t>12</w:t>
+            </w:r>
+          </w:p>
+        </w:tc>
+        <w:tc>
+          <w:tcPr>
+            <w:tcW w:type="dxa" w:w="960"/>
+          </w:tcPr>
+          <w:p>
+            <w:r>
+              <w:t>11183</w:t>
+            </w:r>
+          </w:p>
+        </w:tc>
+        <w:tc>
+          <w:tcPr>
+            <w:tcW w:type="dxa" w:w="960"/>
+          </w:tcPr>
+          <w:p>
+            <w:r>
+              <w:t>12.65%</w:t>
+            </w:r>
+          </w:p>
+        </w:tc>
+        <w:tc>
+          <w:tcPr>
+            <w:tcW w:type="dxa" w:w="960"/>
+          </w:tcPr>
+          <w:p>
+            <w:r>
+              <w:t>1.950x</w:t>
+            </w:r>
+          </w:p>
+        </w:tc>
+        <w:tc>
+          <w:tcPr>
+            <w:tcW w:type="dxa" w:w="960"/>
+          </w:tcPr>
+          <w:p>
+            <w:r>
+              <w:t>True</w:t>
+            </w:r>
+          </w:p>
+        </w:tc>
+        <w:tc>
+          <w:tcPr>
+            <w:tcW w:type="dxa" w:w="960"/>
+          </w:tcPr>
+          <w:p>
+            <w:r>
+              <w:t>0.4996</w:t>
+            </w:r>
+          </w:p>
+        </w:tc>
+        <w:tc>
+          <w:tcPr>
+            <w:tcW w:type="dxa" w:w="960"/>
+          </w:tcPr>
+          <w:p>
+            <w:r>
+              <w:t>0.2468</w:t>
+            </w:r>
+          </w:p>
+        </w:tc>
+        <w:tc>
+          <w:tcPr>
+            <w:tcW w:type="dxa" w:w="960"/>
+          </w:tcPr>
+          <w:p>
+            <w:r>
+              <w:t>0.3304</w:t>
+            </w:r>
+          </w:p>
+        </w:tc>
+        <w:tc>
+          <w:tcPr>
+            <w:tcW w:type="dxa" w:w="960"/>
+          </w:tcPr>
+          <w:p>
+            <w:r>
+              <w:t>0.2123</w:t>
+            </w:r>
+          </w:p>
+        </w:tc>
+      </w:tr>
+      <w:tr>
+        <w:tc>
+          <w:tcPr>
+            <w:tcW w:type="dxa" w:w="960"/>
+          </w:tcPr>
+          <w:p>
+            <w:r>
+              <w:t>15</w:t>
+            </w:r>
+          </w:p>
+        </w:tc>
+        <w:tc>
+          <w:tcPr>
+            <w:tcW w:type="dxa" w:w="960"/>
+          </w:tcPr>
+          <w:p>
+            <w:r>
+              <w:t>3783</w:t>
+            </w:r>
+          </w:p>
+        </w:tc>
+        <w:tc>
+          <w:tcPr>
+            <w:tcW w:type="dxa" w:w="960"/>
+          </w:tcPr>
+          <w:p>
+            <w:r>
+              <w:t>4.28%</w:t>
+            </w:r>
+          </w:p>
+        </w:tc>
+        <w:tc>
+          <w:tcPr>
+            <w:tcW w:type="dxa" w:w="960"/>
+          </w:tcPr>
+          <w:p>
+            <w:r>
+              <w:t>2.255x</w:t>
+            </w:r>
+          </w:p>
+        </w:tc>
+        <w:tc>
+          <w:tcPr>
+            <w:tcW w:type="dxa" w:w="960"/>
+          </w:tcPr>
+          <w:p>
+            <w:r>
+              <w:t>True</w:t>
+            </w:r>
+          </w:p>
+        </w:tc>
+        <w:tc>
+          <w:tcPr>
+            <w:tcW w:type="dxa" w:w="960"/>
+          </w:tcPr>
+          <w:p>
+            <w:r>
+              <w:t>0.5776</w:t>
+            </w:r>
+          </w:p>
+        </w:tc>
+        <w:tc>
+          <w:tcPr>
+            <w:tcW w:type="dxa" w:w="960"/>
+          </w:tcPr>
+          <w:p>
+            <w:r>
+              <w:t>0.0965</w:t>
+            </w:r>
+          </w:p>
+        </w:tc>
+        <w:tc>
+          <w:tcPr>
+            <w:tcW w:type="dxa" w:w="960"/>
+          </w:tcPr>
+          <w:p>
+            <w:r>
+              <w:t>0.1654</w:t>
+            </w:r>
+          </w:p>
+        </w:tc>
+        <w:tc>
+          <w:tcPr>
+            <w:tcW w:type="dxa" w:w="960"/>
+          </w:tcPr>
+          <w:p>
+            <w:r>
+              <w:t>0.1557</w:t>
+            </w:r>
+          </w:p>
+        </w:tc>
+      </w:tr>
+      <w:tr>
+        <w:tc>
+          <w:tcPr>
+            <w:tcW w:type="dxa" w:w="960"/>
+          </w:tcPr>
+          <w:p>
+            <w:r>
+              <w:t>20</w:t>
+            </w:r>
+          </w:p>
+        </w:tc>
+        <w:tc>
+          <w:tcPr>
+            <w:tcW w:type="dxa" w:w="960"/>
+          </w:tcPr>
+          <w:p>
+            <w:r>
+              <w:t>462</w:t>
+            </w:r>
+          </w:p>
+        </w:tc>
+        <w:tc>
+          <w:tcPr>
+            <w:tcW w:type="dxa" w:w="960"/>
+          </w:tcPr>
+          <w:p>
+            <w:r>
+              <w:t>0.52%</w:t>
+            </w:r>
+          </w:p>
+        </w:tc>
+        <w:tc>
+          <w:tcPr>
+            <w:tcW w:type="dxa" w:w="960"/>
+          </w:tcPr>
+          <w:p>
+            <w:r>
+              <w:t>2.620x</w:t>
+            </w:r>
+          </w:p>
+        </w:tc>
+        <w:tc>
+          <w:tcPr>
+            <w:tcW w:type="dxa" w:w="960"/>
+          </w:tcPr>
+          <w:p>
+            <w:r>
+              <w:t>True</w:t>
+            </w:r>
+          </w:p>
+        </w:tc>
+        <w:tc>
+          <w:tcPr>
+            <w:tcW w:type="dxa" w:w="960"/>
+          </w:tcPr>
+          <w:p>
+            <w:r>
+              <w:t>0.671</w:t>
+            </w:r>
+          </w:p>
+        </w:tc>
+        <w:tc>
+          <w:tcPr>
+            <w:tcW w:type="dxa" w:w="960"/>
+          </w:tcPr>
+          <w:p>
+            <w:r>
+              <w:t>0.0137</w:t>
+            </w:r>
+          </w:p>
+        </w:tc>
+        <w:tc>
+          <w:tcPr>
+            <w:tcW w:type="dxa" w:w="960"/>
+          </w:tcPr>
+          <w:p>
+            <w:r>
+              <w:t>0.0268</w:t>
+            </w:r>
+          </w:p>
+        </w:tc>
+        <w:tc>
+          <w:tcPr>
+            <w:tcW w:type="dxa" w:w="960"/>
+          </w:tcPr>
+          <w:p>
+            <w:r>
+              <w:t>0.0689</w:t>
+            </w:r>
+          </w:p>
+        </w:tc>
+      </w:tr>
     </w:tbl>
     <w:p>
       <w:r>
@@ -1013,7 +1381,7 @@
         <w:spacing w:after="280"/>
       </w:pPr>
       <w:r>
-        <w:t>This is the technique's PRIMARY KPI, shown across every candidate threshold Notebook 42 specified ([1, 2, 3, 5, 8]): among customers whose EARLY_WARNING_SCORE clears each candidate, how many times more likely are they to actually default than the base population? The dashed line marks the &gt;= 1.5x KPI target; bars are colored green where a candidate clears it and gray where it does not. Notebook 44 selects the winning candidate directly from this real sweep -- the smallest candidate clearing the bar, or, when none do, the candidate with the real highest lift, flagged NOT RECOMMENDED FOR PRODUCTION.</w:t>
+        <w:t>This is the technique's PRIMARY KPI, shown across every candidate threshold Notebook 42 specified ([1, 2, 3, 5, 8, 10, 12, 15, 20]): among customers whose EARLY_WARNING_SCORE clears each candidate, how many times more likely are they to actually default than the base population? The dashed line marks the &gt;= 1.5x KPI target; bars are colored green where a candidate clears it and gray where it does not. Notebook 44 selects the winning candidate directly from this real sweep -- the smallest candidate clearing the bar, or, when none do, the candidate with the real highest lift, flagged NOT RECOMMENDED FOR PRODUCTION.</w:t>
       </w:r>
     </w:p>
     <w:p>
@@ -1026,7 +1394,7 @@
     </w:p>
     <w:p>
       <w:r>
-        <w:t>Notebook 44 deterministically rebuilt Notebook 43's computation (zero randomness) and reproduced its numbers exactly as an integrity check, then selected the winning candidate: MIN_DEVIATION_COUNT=8, the candidate with the real highest default-rate lift, since none of the tested candidates cleared the KPI on this run -- flagged NOT RECOMMENDED FOR PRODUCTION throughout.</w:t>
+        <w:t>Notebook 44 deterministically rebuilt Notebook 43's computation (zero randomness) and reproduced its numbers exactly as an integrity check, then selected the winning candidate: MIN_DEVIATION_COUNT=10, the smallest candidate clearing the KPI.</w:t>
       </w:r>
     </w:p>
     <w:tbl>
@@ -1056,7 +1424,7 @@
           </w:tcPr>
           <w:p>
             <w:r>
-              <w:t>8</w:t>
+              <w:t>10</w:t>
             </w:r>
           </w:p>
         </w:tc>
@@ -1078,7 +1446,7 @@
           </w:tcPr>
           <w:p>
             <w:r>
-              <w:t>37675</w:t>
+              <w:t>21428</w:t>
             </w:r>
           </w:p>
         </w:tc>
@@ -1100,7 +1468,7 @@
           </w:tcPr>
           <w:p>
             <w:r>
-              <w:t>42.62%</w:t>
+              <w:t>24.24%</w:t>
             </w:r>
           </w:p>
         </w:tc>
@@ -1122,7 +1490,7 @@
           </w:tcPr>
           <w:p>
             <w:r>
-              <w:t>1.408x</w:t>
+              <w:t>1.671x</w:t>
             </w:r>
           </w:p>
         </w:tc>
@@ -1144,7 +1512,7 @@
           </w:tcPr>
           <w:p>
             <w:r>
-              <w:t>[1.394x, 1.420x]</w:t>
+              <w:t>[1.650x, 1.693x]</w:t>
             </w:r>
           </w:p>
         </w:tc>
@@ -1254,7 +1622,7 @@
           </w:tcPr>
           <w:p>
             <w:r>
-              <w:t>False</w:t>
+              <w:t>True</w:t>
             </w:r>
           </w:p>
         </w:tc>
@@ -1276,7 +1644,7 @@
           </w:tcPr>
           <w:p>
             <w:r>
-              <w:t>False</w:t>
+              <w:t>True</w:t>
             </w:r>
           </w:p>
         </w:tc>
@@ -1298,7 +1666,7 @@
           </w:tcPr>
           <w:p>
             <w:r>
-              <w:t>8.554 / 74.761</w:t>
+              <w:t>8.304 / 11.196</w:t>
             </w:r>
           </w:p>
         </w:tc>
@@ -1349,7 +1717,7 @@
           <w:b/>
           <w:sz w:val="20"/>
         </w:rPr>
-        <w:t>Figure 4. Bootstrap Distribution -- Default-Rate Lift @ Candidate=8 (Notebook 44)</w:t>
+        <w:t>Figure 4. Bootstrap Distribution -- Default-Rate Lift @ Candidate=10 (Notebook 44)</w:t>
       </w:r>
     </w:p>
     <w:p>
@@ -1357,7 +1725,7 @@
         <w:spacing w:after="280"/>
       </w:pPr>
       <w:r>
-        <w:t>Rather than trust a single point estimate of 1.41x lift, Notebook 44 resampled the holdout population 2,000 times (with replacement) and recomputed the lift each time -- this histogram is the resulting distribution. The width of the resulting 95% confidence interval, [1.39x, 1.42x], directly reflects how much statistical uncertainty surrounds the point estimate -- a small real alerted population (37,675 of 88,389 holdout customers, 42.62%) makes this estimate more sensitive to individual customers, which is exactly why this wide-interval honesty matters more here than it would for a larger alerted population.</w:t>
+        <w:t>Rather than trust a single point estimate of 1.67x lift, Notebook 44 resampled the holdout population 2,000 times (with replacement) and recomputed the lift each time -- this histogram is the resulting distribution. The width of the resulting 95% confidence interval, [1.65x, 1.69x], directly reflects how much statistical uncertainty surrounds the point estimate -- a small real alerted population (21,428 of 88,389 holdout customers, 24.24%) makes this estimate more sensitive to individual customers, which is exactly why this wide-interval honesty matters more here than it would for a larger alerted population.</w:t>
       </w:r>
     </w:p>
     <w:p>
@@ -1456,7 +1824,7 @@
           </w:tcPr>
           <w:p>
             <w:r>
-              <w:t>8</w:t>
+              <w:t>10</w:t>
             </w:r>
           </w:p>
         </w:tc>
@@ -1522,7 +1890,7 @@
           </w:tcPr>
           <w:p>
             <w:r>
-              <w:t>13,584</w:t>
+              <w:t>9,171</w:t>
             </w:r>
           </w:p>
         </w:tc>
@@ -1544,7 +1912,7 @@
           </w:tcPr>
           <w:p>
             <w:r>
-              <w:t>24,091</w:t>
+              <w:t>12,257</w:t>
             </w:r>
           </w:p>
         </w:tc>
@@ -1566,7 +1934,7 @@
           </w:tcPr>
           <w:p>
             <w:r>
-              <w:t>60.0%</w:t>
+              <w:t>40.5%</w:t>
             </w:r>
           </w:p>
         </w:tc>
@@ -1607,7 +1975,7 @@
           </w:tcPr>
           <w:p>
             <w:r>
-              <w:t>13584</w:t>
+              <w:t>9171</w:t>
             </w:r>
           </w:p>
         </w:tc>
@@ -1651,7 +2019,7 @@
           </w:tcPr>
           <w:p>
             <w:r>
-              <w:t>2038</w:t>
+              <w:t>1376</w:t>
             </w:r>
           </w:p>
         </w:tc>
@@ -1673,7 +2041,7 @@
           </w:tcPr>
           <w:p>
             <w:r>
-              <w:t>$4,585,500</w:t>
+              <w:t>$3,096,000</w:t>
             </w:r>
           </w:p>
         </w:tc>
@@ -1695,7 +2063,7 @@
           </w:tcPr>
           <w:p>
             <w:r>
-              <w:t>24091</w:t>
+              <w:t>12257</w:t>
             </w:r>
           </w:p>
         </w:tc>
@@ -1739,7 +2107,7 @@
           </w:tcPr>
           <w:p>
             <w:r>
-              <w:t>$361,365</w:t>
+              <w:t>$183,855</w:t>
             </w:r>
           </w:p>
         </w:tc>
@@ -1761,7 +2129,7 @@
           </w:tcPr>
           <w:p>
             <w:r>
-              <w:t>$4,224,135</w:t>
+              <w:t>$2,912,145</w:t>
             </w:r>
           </w:p>
         </w:tc>
@@ -1812,7 +2180,7 @@
           <w:b/>
           <w:sz w:val="20"/>
         </w:rPr>
-        <w:t>Figure 6. Population Flagged at Candidate=8 (Notebook 45)</w:t>
+        <w:t>Figure 6. Population Flagged at Candidate=10 (Notebook 45)</w:t>
       </w:r>
     </w:p>
     <w:p>
@@ -1820,7 +2188,7 @@
         <w:spacing w:after="280"/>
       </w:pPr>
       <w:r>
-        <w:t>This is the same 13,584 true positives and 24,091 false positives from Section 5 above, shown visually to make the scale of the flagged population -- and the review-cost exposure it implies -- immediately legible. Every true positive is a dollar of potential loss-prevention opportunity (at the ASSUMPTION intervention success rate); every false positive is a dollar of review cost with no offsetting benefit. The net benefit figure in Section 6 below is exactly the difference between these two populations' dollar impact.</w:t>
+        <w:t>This is the same 9,171 true positives and 12,257 false positives from Section 5 above, shown visually to make the scale of the flagged population -- and the review-cost exposure it implies -- immediately legible. Every true positive is a dollar of potential loss-prevention opportunity (at the ASSUMPTION intervention success rate); every false positive is a dollar of review cost with no offsetting benefit. The net benefit figure in Section 6 below is exactly the difference between these two populations' dollar impact.</w:t>
       </w:r>
     </w:p>
     <w:p>
@@ -1880,7 +2248,7 @@
           </w:tcPr>
           <w:p>
             <w:r>
-              <w:t>$50,689,620</w:t>
+              <w:t>$34,945,740</w:t>
             </w:r>
           </w:p>
         </w:tc>
@@ -1902,7 +2270,7 @@
           </w:tcPr>
           <w:p>
             <w:r>
-              <w:t>168,865%</w:t>
+              <w:t>116,386%</w:t>
             </w:r>
           </w:p>
         </w:tc>
@@ -1987,7 +2355,7 @@
           </w:tcPr>
           <w:p>
             <w:r>
-              <w:t>Work the 37,675-account alert list from the real-time early warning service (candidate MIN_DEVIATION_COUNT=8, 60.0% real defaulter capture) as new statements land -- this is a per-statement, near-real-time signal (not a monthly batch score), so route alerts to same-week outreach, not end-of-cycle review.</w:t>
+              <w:t>Work the 21,428-account alert list from the real-time early warning service (candidate MIN_DEVIATION_COUNT=10, 40.5% real defaulter capture) as new statements land -- this is a per-statement, near-real-time signal (not a monthly batch score), so route alerts to same-week outreach, not end-of-cycle review.</w:t>
             </w:r>
           </w:p>
         </w:tc>
@@ -2009,7 +2377,7 @@
           </w:tcPr>
           <w:p>
             <w:r>
-              <w:t>Track the 2,038-account intervention goal (from the 15% ASSUMPTION success rate) and the 24,091 real false positives (review-cost exposure) as paired weekly KPIs, exactly as Problem 6 tracks its own pair -- both platforms' thresholds trade the same true-positive/false-positive tension, just via different mechanisms (a trained model's threshold vs. this technique's deviation-count threshold).</w:t>
+              <w:t>Track the 1,376-account intervention goal (from the 15% ASSUMPTION success rate) and the 12,257 real false positives (review-cost exposure) as paired weekly KPIs, exactly as Problem 6 tracks its own pair -- both platforms' thresholds trade the same true-positive/false-positive tension, just via different mechanisms (a trained model's threshold vs. this technique's deviation-count threshold).</w:t>
             </w:r>
           </w:p>
         </w:tc>
@@ -2031,7 +2399,7 @@
           </w:tcPr>
           <w:p>
             <w:r>
-              <w:t>Monitor the real default-rate lift (1.41x, 95% CI [1.39x, 1.42x]) and the split-half score PSI (0.0002) every cycle -- a small alerted population (42.62% of holdout) makes the lift point estimate sensitive to individual customers, which is exactly why the bootstrap CI (not just the point estimate) is the number to watch for drift.</w:t>
+              <w:t>Monitor the real default-rate lift (1.67x, 95% CI [1.65x, 1.69x]) and the split-half score PSI (0.0002) every cycle -- a small alerted population (24.24% of holdout) makes the lift point estimate sensitive to individual customers, which is exactly why the bootstrap CI (not just the point estimate) is the number to watch for drift.</w:t>
             </w:r>
           </w:p>
         </w:tc>
@@ -2053,7 +2421,7 @@
           </w:tcPr>
           <w:p>
             <w:r>
-              <w:t>File Notebook 44's bootstrap lift/AUC CIs, score-rank calibration monotonicity (True), and lift-KPI result (NOT MET) with the technique's annual governance packet; note this is an unsupervised, rule-based statistical-process-control technique, not a trained classifier, so its governance review should assess policy-parameter stability (Z_THRESHOLD, MIN_DEVIATION_COUNT), not model retraining cadence. Currently NOT RECOMMENDED for production.</w:t>
+              <w:t>File Notebook 44's bootstrap lift/AUC CIs, score-rank calibration monotonicity (True), and lift-KPI result (MET) with the technique's annual governance packet; note this is an unsupervised, rule-based statistical-process-control technique, not a trained classifier, so its governance review should assess policy-parameter stability (Z_THRESHOLD, MIN_DEVIATION_COUNT), not model retraining cadence. Currently RECOMMENDED for production.</w:t>
             </w:r>
           </w:p>
         </w:tc>
@@ -2075,7 +2443,7 @@
           </w:tcPr>
           <w:p>
             <w:r>
-              <w:t>Use the 13,584 alert-flagged real defaulters to trigger EARLY, same-cycle reserve-timing reviews on accounts whose deviation from their own baseline may predate what Problem 6's recency model or Problem 1's full-history model would flag -- coordinate with Problem 3's ECL work and Problem 4's tier-differentiated LGD for the $ reserve amount per flagged account.</w:t>
+              <w:t>Use the 9,171 alert-flagged real defaulters to trigger EARLY, same-cycle reserve-timing reviews on accounts whose deviation from their own baseline may predate what Problem 6's recency model or Problem 1's full-history model would flag -- coordinate with Problem 3's ECL work and Problem 4's tier-differentiated LGD for the $ reserve amount per flagged account.</w:t>
             </w:r>
           </w:p>
         </w:tc>
@@ -2097,7 +2465,7 @@
           </w:tcPr>
           <w:p>
             <w:r>
-              <w:t>Approve the $30,000 investment given an estimated 0.0 months payback and 168,865% Year-1 ROI (net of estimated false-positive review cost) from monthly-equivalent alert triage; note this technique's lower implementation cost than Problem 6's ($30,000 vs. Problem 6's assumption) reflects its stateless, rule-based nature -- no model training/retraining pipeline to build.</w:t>
+              <w:t>Approve the $30,000 investment given an estimated 0.0 months payback and 116,386% Year-1 ROI (net of estimated false-positive review cost) from monthly-equivalent alert triage; note this technique's lower implementation cost than Problem 6's ($30,000 vs. Problem 6's assumption) reflects its stateless, rule-based nature -- no model training/retraining pipeline to build.</w:t>
             </w:r>
           </w:p>
         </w:tc>
@@ -2357,7 +2725,7 @@
     </w:p>
     <w:p>
       <w:r>
-        <w:t>Overall deployment status: NOT RECOMMENDED FOR PRODUCTION. This is the best-performing candidate tested on this run and is packaged here for completeness (policy artifact, real-time alert service, full validation) so the platform's tooling exists end to end -- but it should not be deployed to production until a future run either finds a candidate that clears the KPI or the KPI target itself is revisited with the business stakeholder.</w:t>
+        <w:t>Overall deployment status: RECOMMENDED FOR PRODUCTION. This technique clears its KPI, statistical validation, and API self-test bars -- deploy per Notebook 44's deployment readiness checklist.</w:t>
       </w:r>
     </w:p>
     <w:sectPr>

</xml_diff>